<commit_message>
Fix CV: Halyna Lavrik name on one line
</commit_message>
<xml_diff>
--- a/CV_Halyna_Lavrik.docx
+++ b/CV_Halyna_Lavrik.docx
@@ -291,7 +291,7 @@
                           <w:p>
                             <w:pPr>
                               <w:spacing w:line="427" w:lineRule="exact"/>
-                              <w:ind w:left="3425" w:right="3841"/>
+                              <w:ind w:right="0"/>
                               <w:jc w:val="center"/>
                               <w:rPr>
                                 <w:b/>
@@ -341,7 +341,7 @@
                     <w:p>
                       <w:pPr>
                         <w:spacing w:line="427" w:lineRule="exact"/>
-                        <w:ind w:left="3425" w:right="3841"/>
+                        <w:ind w:right="0"/>
                         <w:jc w:val="center"/>
                         <w:rPr>
                           <w:b/>

</xml_diff>